<commit_message>
Refactor scheduling and backup job integration in schedule_pipeline_day.py
- Enhanced the scheduling logic to include a daily backup job alongside the next day's global job.
- Updated the main function to manage and display results for both scheduled jobs effectively.
- Modified run_pipeline.py to incorporate the new daily backup command and establish its dependency on the global job.
</commit_message>
<xml_diff>
--- a/docs/Pipeline_Operations_Guide_2026-04-16.docx
+++ b/docs/Pipeline_Operations_Guide_2026-04-16.docx
@@ -108,12 +108,6 @@
         <w:gridCol w:w="6360"/>
       </w:tblGrid>
       <w:tr>
-        <w:tblPrEx>
-          <w:tblCellMar>
-            <w:top w:w="0" w:type="dxa"/>
-            <w:bottom w:w="0" w:type="dxa"/>
-          </w:tblCellMar>
-        </w:tblPrEx>
         <w:tc>
           <w:tcPr>
             <w:tcW w:w="3000" w:type="dxa"/>
@@ -176,12 +170,6 @@
         </w:tc>
       </w:tr>
       <w:tr>
-        <w:tblPrEx>
-          <w:tblCellMar>
-            <w:top w:w="0" w:type="dxa"/>
-            <w:bottom w:w="0" w:type="dxa"/>
-          </w:tblCellMar>
-        </w:tblPrEx>
         <w:tc>
           <w:tcPr>
             <w:tcW w:w="3000" w:type="dxa"/>
@@ -259,12 +247,6 @@
         </w:tc>
       </w:tr>
       <w:tr>
-        <w:tblPrEx>
-          <w:tblCellMar>
-            <w:top w:w="0" w:type="dxa"/>
-            <w:bottom w:w="0" w:type="dxa"/>
-          </w:tblCellMar>
-        </w:tblPrEx>
         <w:tc>
           <w:tcPr>
             <w:tcW w:w="3000" w:type="dxa"/>
@@ -427,12 +409,6 @@
         <w:gridCol w:w="5760"/>
       </w:tblGrid>
       <w:tr>
-        <w:tblPrEx>
-          <w:tblCellMar>
-            <w:top w:w="0" w:type="dxa"/>
-            <w:bottom w:w="0" w:type="dxa"/>
-          </w:tblCellMar>
-        </w:tblPrEx>
         <w:tc>
           <w:tcPr>
             <w:tcW w:w="1400" w:type="dxa"/>
@@ -525,12 +501,6 @@
         </w:tc>
       </w:tr>
       <w:tr>
-        <w:tblPrEx>
-          <w:tblCellMar>
-            <w:top w:w="0" w:type="dxa"/>
-            <w:bottom w:w="0" w:type="dxa"/>
-          </w:tblCellMar>
-        </w:tblPrEx>
         <w:tc>
           <w:tcPr>
             <w:tcW w:w="1400" w:type="dxa"/>
@@ -735,12 +705,6 @@
         </w:tc>
       </w:tr>
       <w:tr>
-        <w:tblPrEx>
-          <w:tblCellMar>
-            <w:top w:w="0" w:type="dxa"/>
-            <w:bottom w:w="0" w:type="dxa"/>
-          </w:tblCellMar>
-        </w:tblPrEx>
         <w:tc>
           <w:tcPr>
             <w:tcW w:w="1400" w:type="dxa"/>
@@ -935,12 +899,6 @@
         </w:tc>
       </w:tr>
       <w:tr>
-        <w:tblPrEx>
-          <w:tblCellMar>
-            <w:top w:w="0" w:type="dxa"/>
-            <w:bottom w:w="0" w:type="dxa"/>
-          </w:tblCellMar>
-        </w:tblPrEx>
         <w:tc>
           <w:tcPr>
             <w:tcW w:w="1400" w:type="dxa"/>
@@ -1191,12 +1149,6 @@
         <w:gridCol w:w="5160"/>
       </w:tblGrid>
       <w:tr>
-        <w:tblPrEx>
-          <w:tblCellMar>
-            <w:top w:w="0" w:type="dxa"/>
-            <w:bottom w:w="0" w:type="dxa"/>
-          </w:tblCellMar>
-        </w:tblPrEx>
         <w:tc>
           <w:tcPr>
             <w:tcW w:w="2400" w:type="dxa"/>
@@ -1291,12 +1243,6 @@
         </w:tc>
       </w:tr>
       <w:tr>
-        <w:tblPrEx>
-          <w:tblCellMar>
-            <w:top w:w="0" w:type="dxa"/>
-            <w:bottom w:w="0" w:type="dxa"/>
-          </w:tblCellMar>
-        </w:tblPrEx>
         <w:tc>
           <w:tcPr>
             <w:tcW w:w="2400" w:type="dxa"/>
@@ -1388,12 +1334,6 @@
         </w:tc>
       </w:tr>
       <w:tr>
-        <w:tblPrEx>
-          <w:tblCellMar>
-            <w:top w:w="0" w:type="dxa"/>
-            <w:bottom w:w="0" w:type="dxa"/>
-          </w:tblCellMar>
-        </w:tblPrEx>
         <w:tc>
           <w:tcPr>
             <w:tcW w:w="2400" w:type="dxa"/>
@@ -1484,12 +1424,6 @@
         </w:tc>
       </w:tr>
       <w:tr>
-        <w:tblPrEx>
-          <w:tblCellMar>
-            <w:top w:w="0" w:type="dxa"/>
-            <w:bottom w:w="0" w:type="dxa"/>
-          </w:tblCellMar>
-        </w:tblPrEx>
         <w:tc>
           <w:tcPr>
             <w:tcW w:w="2400" w:type="dxa"/>
@@ -1580,12 +1514,6 @@
         </w:tc>
       </w:tr>
       <w:tr>
-        <w:tblPrEx>
-          <w:tblCellMar>
-            <w:top w:w="0" w:type="dxa"/>
-            <w:bottom w:w="0" w:type="dxa"/>
-          </w:tblCellMar>
-        </w:tblPrEx>
         <w:tc>
           <w:tcPr>
             <w:tcW w:w="2400" w:type="dxa"/>
@@ -1676,12 +1604,6 @@
         </w:tc>
       </w:tr>
       <w:tr>
-        <w:tblPrEx>
-          <w:tblCellMar>
-            <w:top w:w="0" w:type="dxa"/>
-            <w:bottom w:w="0" w:type="dxa"/>
-          </w:tblCellMar>
-        </w:tblPrEx>
         <w:tc>
           <w:tcPr>
             <w:tcW w:w="2400" w:type="dxa"/>
@@ -1829,12 +1751,6 @@
         <w:gridCol w:w="4760"/>
       </w:tblGrid>
       <w:tr>
-        <w:tblPrEx>
-          <w:tblCellMar>
-            <w:top w:w="0" w:type="dxa"/>
-            <w:bottom w:w="0" w:type="dxa"/>
-          </w:tblCellMar>
-        </w:tblPrEx>
         <w:tc>
           <w:tcPr>
             <w:tcW w:w="2400" w:type="dxa"/>
@@ -1929,12 +1845,6 @@
         </w:tc>
       </w:tr>
       <w:tr>
-        <w:tblPrEx>
-          <w:tblCellMar>
-            <w:top w:w="0" w:type="dxa"/>
-            <w:bottom w:w="0" w:type="dxa"/>
-          </w:tblCellMar>
-        </w:tblPrEx>
         <w:tc>
           <w:tcPr>
             <w:tcW w:w="2400" w:type="dxa"/>
@@ -2025,12 +1935,6 @@
         </w:tc>
       </w:tr>
       <w:tr>
-        <w:tblPrEx>
-          <w:tblCellMar>
-            <w:top w:w="0" w:type="dxa"/>
-            <w:bottom w:w="0" w:type="dxa"/>
-          </w:tblCellMar>
-        </w:tblPrEx>
         <w:tc>
           <w:tcPr>
             <w:tcW w:w="2400" w:type="dxa"/>
@@ -2121,12 +2025,6 @@
         </w:tc>
       </w:tr>
       <w:tr>
-        <w:tblPrEx>
-          <w:tblCellMar>
-            <w:top w:w="0" w:type="dxa"/>
-            <w:bottom w:w="0" w:type="dxa"/>
-          </w:tblCellMar>
-        </w:tblPrEx>
         <w:tc>
           <w:tcPr>
             <w:tcW w:w="2400" w:type="dxa"/>
@@ -2215,12 +2113,6 @@
         </w:tc>
       </w:tr>
       <w:tr>
-        <w:tblPrEx>
-          <w:tblCellMar>
-            <w:top w:w="0" w:type="dxa"/>
-            <w:bottom w:w="0" w:type="dxa"/>
-          </w:tblCellMar>
-        </w:tblPrEx>
         <w:tc>
           <w:tcPr>
             <w:tcW w:w="2400" w:type="dxa"/>
@@ -2311,12 +2203,6 @@
         </w:tc>
       </w:tr>
       <w:tr>
-        <w:tblPrEx>
-          <w:tblCellMar>
-            <w:top w:w="0" w:type="dxa"/>
-            <w:bottom w:w="0" w:type="dxa"/>
-          </w:tblCellMar>
-        </w:tblPrEx>
         <w:tc>
           <w:tcPr>
             <w:tcW w:w="2400" w:type="dxa"/>
@@ -2443,12 +2329,6 @@
         <w:gridCol w:w="4257"/>
       </w:tblGrid>
       <w:tr>
-        <w:tblPrEx>
-          <w:tblCellMar>
-            <w:top w:w="0" w:type="dxa"/>
-            <w:bottom w:w="0" w:type="dxa"/>
-          </w:tblCellMar>
-        </w:tblPrEx>
         <w:tc>
           <w:tcPr>
             <w:tcW w:w="2400" w:type="dxa"/>
@@ -2543,12 +2423,6 @@
         </w:tc>
       </w:tr>
       <w:tr>
-        <w:tblPrEx>
-          <w:tblCellMar>
-            <w:top w:w="0" w:type="dxa"/>
-            <w:bottom w:w="0" w:type="dxa"/>
-          </w:tblCellMar>
-        </w:tblPrEx>
         <w:tc>
           <w:tcPr>
             <w:tcW w:w="2400" w:type="dxa"/>
@@ -2715,12 +2589,6 @@
         <w:gridCol w:w="6960"/>
       </w:tblGrid>
       <w:tr>
-        <w:tblPrEx>
-          <w:tblCellMar>
-            <w:top w:w="0" w:type="dxa"/>
-            <w:bottom w:w="0" w:type="dxa"/>
-          </w:tblCellMar>
-        </w:tblPrEx>
         <w:tc>
           <w:tcPr>
             <w:tcW w:w="2400" w:type="dxa"/>
@@ -2785,12 +2653,6 @@
         </w:tc>
       </w:tr>
       <w:tr>
-        <w:tblPrEx>
-          <w:tblCellMar>
-            <w:top w:w="0" w:type="dxa"/>
-            <w:bottom w:w="0" w:type="dxa"/>
-          </w:tblCellMar>
-        </w:tblPrEx>
         <w:tc>
           <w:tcPr>
             <w:tcW w:w="2400" w:type="dxa"/>
@@ -2855,12 +2717,6 @@
         </w:tc>
       </w:tr>
       <w:tr>
-        <w:tblPrEx>
-          <w:tblCellMar>
-            <w:top w:w="0" w:type="dxa"/>
-            <w:bottom w:w="0" w:type="dxa"/>
-          </w:tblCellMar>
-        </w:tblPrEx>
         <w:tc>
           <w:tcPr>
             <w:tcW w:w="2400" w:type="dxa"/>
@@ -2945,12 +2801,6 @@
         </w:tc>
       </w:tr>
       <w:tr>
-        <w:tblPrEx>
-          <w:tblCellMar>
-            <w:top w:w="0" w:type="dxa"/>
-            <w:bottom w:w="0" w:type="dxa"/>
-          </w:tblCellMar>
-        </w:tblPrEx>
         <w:tc>
           <w:tcPr>
             <w:tcW w:w="2400" w:type="dxa"/>
@@ -3013,12 +2863,6 @@
         </w:tc>
       </w:tr>
       <w:tr>
-        <w:tblPrEx>
-          <w:tblCellMar>
-            <w:top w:w="0" w:type="dxa"/>
-            <w:bottom w:w="0" w:type="dxa"/>
-          </w:tblCellMar>
-        </w:tblPrEx>
         <w:tc>
           <w:tcPr>
             <w:tcW w:w="2400" w:type="dxa"/>
@@ -3103,12 +2947,6 @@
         </w:tc>
       </w:tr>
       <w:tr>
-        <w:tblPrEx>
-          <w:tblCellMar>
-            <w:top w:w="0" w:type="dxa"/>
-            <w:bottom w:w="0" w:type="dxa"/>
-          </w:tblCellMar>
-        </w:tblPrEx>
         <w:tc>
           <w:tcPr>
             <w:tcW w:w="2400" w:type="dxa"/>
@@ -3417,12 +3255,6 @@
         <w:gridCol w:w="6160"/>
       </w:tblGrid>
       <w:tr>
-        <w:tblPrEx>
-          <w:tblCellMar>
-            <w:top w:w="0" w:type="dxa"/>
-            <w:bottom w:w="0" w:type="dxa"/>
-          </w:tblCellMar>
-        </w:tblPrEx>
         <w:tc>
           <w:tcPr>
             <w:tcW w:w="3200" w:type="dxa"/>
@@ -3485,12 +3317,6 @@
         </w:tc>
       </w:tr>
       <w:tr>
-        <w:tblPrEx>
-          <w:tblCellMar>
-            <w:top w:w="0" w:type="dxa"/>
-            <w:bottom w:w="0" w:type="dxa"/>
-          </w:tblCellMar>
-        </w:tblPrEx>
         <w:tc>
           <w:tcPr>
             <w:tcW w:w="3200" w:type="dxa"/>
@@ -3568,12 +3394,6 @@
         </w:tc>
       </w:tr>
       <w:tr>
-        <w:tblPrEx>
-          <w:tblCellMar>
-            <w:top w:w="0" w:type="dxa"/>
-            <w:bottom w:w="0" w:type="dxa"/>
-          </w:tblCellMar>
-        </w:tblPrEx>
         <w:tc>
           <w:tcPr>
             <w:tcW w:w="3200" w:type="dxa"/>
@@ -3651,12 +3471,6 @@
         </w:tc>
       </w:tr>
       <w:tr>
-        <w:tblPrEx>
-          <w:tblCellMar>
-            <w:top w:w="0" w:type="dxa"/>
-            <w:bottom w:w="0" w:type="dxa"/>
-          </w:tblCellMar>
-        </w:tblPrEx>
         <w:tc>
           <w:tcPr>
             <w:tcW w:w="3200" w:type="dxa"/>
@@ -3716,12 +3530,6 @@
         </w:tc>
       </w:tr>
       <w:tr>
-        <w:tblPrEx>
-          <w:tblCellMar>
-            <w:top w:w="0" w:type="dxa"/>
-            <w:bottom w:w="0" w:type="dxa"/>
-          </w:tblCellMar>
-        </w:tblPrEx>
         <w:tc>
           <w:tcPr>
             <w:tcW w:w="3200" w:type="dxa"/>
@@ -3799,12 +3607,6 @@
         </w:tc>
       </w:tr>
       <w:tr>
-        <w:tblPrEx>
-          <w:tblCellMar>
-            <w:top w:w="0" w:type="dxa"/>
-            <w:bottom w:w="0" w:type="dxa"/>
-          </w:tblCellMar>
-        </w:tblPrEx>
         <w:tc>
           <w:tcPr>
             <w:tcW w:w="3200" w:type="dxa"/>
@@ -3864,12 +3666,6 @@
         </w:tc>
       </w:tr>
       <w:tr>
-        <w:tblPrEx>
-          <w:tblCellMar>
-            <w:top w:w="0" w:type="dxa"/>
-            <w:bottom w:w="0" w:type="dxa"/>
-          </w:tblCellMar>
-        </w:tblPrEx>
         <w:tc>
           <w:tcPr>
             <w:tcW w:w="3200" w:type="dxa"/>
@@ -3929,12 +3725,6 @@
         </w:tc>
       </w:tr>
       <w:tr>
-        <w:tblPrEx>
-          <w:tblCellMar>
-            <w:top w:w="0" w:type="dxa"/>
-            <w:bottom w:w="0" w:type="dxa"/>
-          </w:tblCellMar>
-        </w:tblPrEx>
         <w:tc>
           <w:tcPr>
             <w:tcW w:w="3200" w:type="dxa"/>
@@ -4030,12 +3820,6 @@
         </w:tc>
       </w:tr>
       <w:tr>
-        <w:tblPrEx>
-          <w:tblCellMar>
-            <w:top w:w="0" w:type="dxa"/>
-            <w:bottom w:w="0" w:type="dxa"/>
-          </w:tblCellMar>
-        </w:tblPrEx>
         <w:tc>
           <w:tcPr>
             <w:tcW w:w="3200" w:type="dxa"/>
@@ -4583,12 +4367,6 @@
         <w:gridCol w:w="7360"/>
       </w:tblGrid>
       <w:tr>
-        <w:tblPrEx>
-          <w:tblCellMar>
-            <w:top w:w="0" w:type="dxa"/>
-            <w:bottom w:w="0" w:type="dxa"/>
-          </w:tblCellMar>
-        </w:tblPrEx>
         <w:tc>
           <w:tcPr>
             <w:tcW w:w="2000" w:type="dxa"/>
@@ -4651,12 +4429,6 @@
         </w:tc>
       </w:tr>
       <w:tr>
-        <w:tblPrEx>
-          <w:tblCellMar>
-            <w:top w:w="0" w:type="dxa"/>
-            <w:bottom w:w="0" w:type="dxa"/>
-          </w:tblCellMar>
-        </w:tblPrEx>
         <w:tc>
           <w:tcPr>
             <w:tcW w:w="2000" w:type="dxa"/>
@@ -4734,12 +4506,6 @@
         </w:tc>
       </w:tr>
       <w:tr>
-        <w:tblPrEx>
-          <w:tblCellMar>
-            <w:top w:w="0" w:type="dxa"/>
-            <w:bottom w:w="0" w:type="dxa"/>
-          </w:tblCellMar>
-        </w:tblPrEx>
         <w:tc>
           <w:tcPr>
             <w:tcW w:w="2000" w:type="dxa"/>
@@ -4827,12 +4593,6 @@
         </w:tc>
       </w:tr>
       <w:tr>
-        <w:tblPrEx>
-          <w:tblCellMar>
-            <w:top w:w="0" w:type="dxa"/>
-            <w:bottom w:w="0" w:type="dxa"/>
-          </w:tblCellMar>
-        </w:tblPrEx>
         <w:tc>
           <w:tcPr>
             <w:tcW w:w="2000" w:type="dxa"/>
@@ -4910,12 +4670,6 @@
         </w:tc>
       </w:tr>
       <w:tr>
-        <w:tblPrEx>
-          <w:tblCellMar>
-            <w:top w:w="0" w:type="dxa"/>
-            <w:bottom w:w="0" w:type="dxa"/>
-          </w:tblCellMar>
-        </w:tblPrEx>
         <w:tc>
           <w:tcPr>
             <w:tcW w:w="2000" w:type="dxa"/>
@@ -4993,12 +4747,6 @@
         </w:tc>
       </w:tr>
       <w:tr>
-        <w:tblPrEx>
-          <w:tblCellMar>
-            <w:top w:w="0" w:type="dxa"/>
-            <w:bottom w:w="0" w:type="dxa"/>
-          </w:tblCellMar>
-        </w:tblPrEx>
         <w:tc>
           <w:tcPr>
             <w:tcW w:w="2000" w:type="dxa"/>
@@ -5298,12 +5046,6 @@
         <w:gridCol w:w="5360"/>
       </w:tblGrid>
       <w:tr>
-        <w:tblPrEx>
-          <w:tblCellMar>
-            <w:top w:w="0" w:type="dxa"/>
-            <w:bottom w:w="0" w:type="dxa"/>
-          </w:tblCellMar>
-        </w:tblPrEx>
         <w:tc>
           <w:tcPr>
             <w:tcW w:w="4000" w:type="dxa"/>
@@ -5366,12 +5108,6 @@
         </w:tc>
       </w:tr>
       <w:tr>
-        <w:tblPrEx>
-          <w:tblCellMar>
-            <w:top w:w="0" w:type="dxa"/>
-            <w:bottom w:w="0" w:type="dxa"/>
-          </w:tblCellMar>
-        </w:tblPrEx>
         <w:tc>
           <w:tcPr>
             <w:tcW w:w="4000" w:type="dxa"/>
@@ -5467,12 +5203,6 @@
         </w:tc>
       </w:tr>
       <w:tr>
-        <w:tblPrEx>
-          <w:tblCellMar>
-            <w:top w:w="0" w:type="dxa"/>
-            <w:bottom w:w="0" w:type="dxa"/>
-          </w:tblCellMar>
-        </w:tblPrEx>
         <w:tc>
           <w:tcPr>
             <w:tcW w:w="4000" w:type="dxa"/>
@@ -5551,12 +5281,6 @@
         </w:tc>
       </w:tr>
       <w:tr>
-        <w:tblPrEx>
-          <w:tblCellMar>
-            <w:top w:w="0" w:type="dxa"/>
-            <w:bottom w:w="0" w:type="dxa"/>
-          </w:tblCellMar>
-        </w:tblPrEx>
         <w:tc>
           <w:tcPr>
             <w:tcW w:w="4000" w:type="dxa"/>
@@ -5654,12 +5378,6 @@
         </w:tc>
       </w:tr>
       <w:tr>
-        <w:tblPrEx>
-          <w:tblCellMar>
-            <w:top w:w="0" w:type="dxa"/>
-            <w:bottom w:w="0" w:type="dxa"/>
-          </w:tblCellMar>
-        </w:tblPrEx>
         <w:tc>
           <w:tcPr>
             <w:tcW w:w="4000" w:type="dxa"/>
@@ -5863,12 +5581,6 @@
         </w:tc>
       </w:tr>
       <w:tr>
-        <w:tblPrEx>
-          <w:tblCellMar>
-            <w:top w:w="0" w:type="dxa"/>
-            <w:bottom w:w="0" w:type="dxa"/>
-          </w:tblCellMar>
-        </w:tblPrEx>
         <w:tc>
           <w:tcPr>
             <w:tcW w:w="4000" w:type="dxa"/>
@@ -5964,12 +5676,6 @@
         </w:tc>
       </w:tr>
       <w:tr>
-        <w:tblPrEx>
-          <w:tblCellMar>
-            <w:top w:w="0" w:type="dxa"/>
-            <w:bottom w:w="0" w:type="dxa"/>
-          </w:tblCellMar>
-        </w:tblPrEx>
         <w:tc>
           <w:tcPr>
             <w:tcW w:w="4000" w:type="dxa"/>
@@ -6029,12 +5735,6 @@
         </w:tc>
       </w:tr>
       <w:tr>
-        <w:tblPrEx>
-          <w:tblCellMar>
-            <w:top w:w="0" w:type="dxa"/>
-            <w:bottom w:w="0" w:type="dxa"/>
-          </w:tblCellMar>
-        </w:tblPrEx>
         <w:tc>
           <w:tcPr>
             <w:tcW w:w="4000" w:type="dxa"/>
@@ -6112,12 +5812,6 @@
         </w:tc>
       </w:tr>
       <w:tr>
-        <w:tblPrEx>
-          <w:tblCellMar>
-            <w:top w:w="0" w:type="dxa"/>
-            <w:bottom w:w="0" w:type="dxa"/>
-          </w:tblCellMar>
-        </w:tblPrEx>
         <w:tc>
           <w:tcPr>
             <w:tcW w:w="4000" w:type="dxa"/>
@@ -6213,12 +5907,6 @@
         </w:tc>
       </w:tr>
       <w:tr>
-        <w:tblPrEx>
-          <w:tblCellMar>
-            <w:top w:w="0" w:type="dxa"/>
-            <w:bottom w:w="0" w:type="dxa"/>
-          </w:tblCellMar>
-        </w:tblPrEx>
         <w:tc>
           <w:tcPr>
             <w:tcW w:w="4000" w:type="dxa"/>
@@ -6296,12 +5984,6 @@
         </w:tc>
       </w:tr>
       <w:tr>
-        <w:tblPrEx>
-          <w:tblCellMar>
-            <w:top w:w="0" w:type="dxa"/>
-            <w:bottom w:w="0" w:type="dxa"/>
-          </w:tblCellMar>
-        </w:tblPrEx>
         <w:tc>
           <w:tcPr>
             <w:tcW w:w="4000" w:type="dxa"/>
@@ -6371,12 +6053,6 @@
         </w:tc>
       </w:tr>
       <w:tr>
-        <w:tblPrEx>
-          <w:tblCellMar>
-            <w:top w:w="0" w:type="dxa"/>
-            <w:bottom w:w="0" w:type="dxa"/>
-          </w:tblCellMar>
-        </w:tblPrEx>
         <w:tc>
           <w:tcPr>
             <w:tcW w:w="4000" w:type="dxa"/>
@@ -6548,7 +6224,7 @@
     <w:p>
       <w:pPr>
         <w:pBdr>
-          <w:left w:val="single" w:sz="4" w:space="6" w:color="94A3B8"/>
+          <w:left w:val="single" w:sz="4" w:space="0" w:color="94A3B8"/>
         </w:pBdr>
         <w:shd w:val="clear" w:color="auto" w:fill="F1F5F9"/>
         <w:spacing w:after="60"/>
@@ -6567,7 +6243,7 @@
     <w:p>
       <w:pPr>
         <w:pBdr>
-          <w:left w:val="single" w:sz="4" w:space="6" w:color="94A3B8"/>
+          <w:left w:val="single" w:sz="4" w:space="0" w:color="94A3B8"/>
         </w:pBdr>
         <w:shd w:val="clear" w:color="auto" w:fill="F1F5F9"/>
         <w:spacing w:after="60"/>
@@ -6825,12 +6501,6 @@
         <w:gridCol w:w="4713"/>
       </w:tblGrid>
       <w:tr>
-        <w:tblPrEx>
-          <w:tblCellMar>
-            <w:top w:w="0" w:type="dxa"/>
-            <w:bottom w:w="0" w:type="dxa"/>
-          </w:tblCellMar>
-        </w:tblPrEx>
         <w:tc>
           <w:tcPr>
             <w:tcW w:w="1800" w:type="dxa"/>
@@ -6925,12 +6595,6 @@
         </w:tc>
       </w:tr>
       <w:tr>
-        <w:tblPrEx>
-          <w:tblCellMar>
-            <w:top w:w="0" w:type="dxa"/>
-            <w:bottom w:w="0" w:type="dxa"/>
-          </w:tblCellMar>
-        </w:tblPrEx>
         <w:tc>
           <w:tcPr>
             <w:tcW w:w="1800" w:type="dxa"/>
@@ -7021,12 +6685,6 @@
         </w:tc>
       </w:tr>
       <w:tr>
-        <w:tblPrEx>
-          <w:tblCellMar>
-            <w:top w:w="0" w:type="dxa"/>
-            <w:bottom w:w="0" w:type="dxa"/>
-          </w:tblCellMar>
-        </w:tblPrEx>
         <w:tc>
           <w:tcPr>
             <w:tcW w:w="1800" w:type="dxa"/>
@@ -7116,12 +6774,6 @@
         </w:tc>
       </w:tr>
       <w:tr>
-        <w:tblPrEx>
-          <w:tblCellMar>
-            <w:top w:w="0" w:type="dxa"/>
-            <w:bottom w:w="0" w:type="dxa"/>
-          </w:tblCellMar>
-        </w:tblPrEx>
         <w:tc>
           <w:tcPr>
             <w:tcW w:w="1800" w:type="dxa"/>
@@ -7211,12 +6863,6 @@
         </w:tc>
       </w:tr>
       <w:tr>
-        <w:tblPrEx>
-          <w:tblCellMar>
-            <w:top w:w="0" w:type="dxa"/>
-            <w:bottom w:w="0" w:type="dxa"/>
-          </w:tblCellMar>
-        </w:tblPrEx>
         <w:tc>
           <w:tcPr>
             <w:tcW w:w="1800" w:type="dxa"/>
@@ -7306,12 +6952,6 @@
         </w:tc>
       </w:tr>
       <w:tr>
-        <w:tblPrEx>
-          <w:tblCellMar>
-            <w:top w:w="0" w:type="dxa"/>
-            <w:bottom w:w="0" w:type="dxa"/>
-          </w:tblCellMar>
-        </w:tblPrEx>
         <w:tc>
           <w:tcPr>
             <w:tcW w:w="1800" w:type="dxa"/>
@@ -7401,12 +7041,6 @@
         </w:tc>
       </w:tr>
       <w:tr>
-        <w:tblPrEx>
-          <w:tblCellMar>
-            <w:top w:w="0" w:type="dxa"/>
-            <w:bottom w:w="0" w:type="dxa"/>
-          </w:tblCellMar>
-        </w:tblPrEx>
         <w:tc>
           <w:tcPr>
             <w:tcW w:w="1800" w:type="dxa"/>
@@ -7496,12 +7130,6 @@
         </w:tc>
       </w:tr>
       <w:tr>
-        <w:tblPrEx>
-          <w:tblCellMar>
-            <w:top w:w="0" w:type="dxa"/>
-            <w:bottom w:w="0" w:type="dxa"/>
-          </w:tblCellMar>
-        </w:tblPrEx>
         <w:tc>
           <w:tcPr>
             <w:tcW w:w="1800" w:type="dxa"/>
@@ -7591,12 +7219,6 @@
         </w:tc>
       </w:tr>
       <w:tr>
-        <w:tblPrEx>
-          <w:tblCellMar>
-            <w:top w:w="0" w:type="dxa"/>
-            <w:bottom w:w="0" w:type="dxa"/>
-          </w:tblCellMar>
-        </w:tblPrEx>
         <w:tc>
           <w:tcPr>
             <w:tcW w:w="1800" w:type="dxa"/>
@@ -7684,12 +7306,6 @@
         </w:tc>
       </w:tr>
       <w:tr>
-        <w:tblPrEx>
-          <w:tblCellMar>
-            <w:top w:w="0" w:type="dxa"/>
-            <w:bottom w:w="0" w:type="dxa"/>
-          </w:tblCellMar>
-        </w:tblPrEx>
         <w:tc>
           <w:tcPr>
             <w:tcW w:w="1800" w:type="dxa"/>
@@ -7779,12 +7395,6 @@
         </w:tc>
       </w:tr>
       <w:tr>
-        <w:tblPrEx>
-          <w:tblCellMar>
-            <w:top w:w="0" w:type="dxa"/>
-            <w:bottom w:w="0" w:type="dxa"/>
-          </w:tblCellMar>
-        </w:tblPrEx>
         <w:tc>
           <w:tcPr>
             <w:tcW w:w="1800" w:type="dxa"/>
@@ -7874,12 +7484,6 @@
         </w:tc>
       </w:tr>
       <w:tr>
-        <w:tblPrEx>
-          <w:tblCellMar>
-            <w:top w:w="0" w:type="dxa"/>
-            <w:bottom w:w="0" w:type="dxa"/>
-          </w:tblCellMar>
-        </w:tblPrEx>
         <w:tc>
           <w:tcPr>
             <w:tcW w:w="1800" w:type="dxa"/>
@@ -7967,12 +7571,6 @@
         </w:tc>
       </w:tr>
       <w:tr>
-        <w:tblPrEx>
-          <w:tblCellMar>
-            <w:top w:w="0" w:type="dxa"/>
-            <w:bottom w:w="0" w:type="dxa"/>
-          </w:tblCellMar>
-        </w:tblPrEx>
         <w:tc>
           <w:tcPr>
             <w:tcW w:w="1800" w:type="dxa"/>
@@ -8062,12 +7660,6 @@
         </w:tc>
       </w:tr>
       <w:tr>
-        <w:tblPrEx>
-          <w:tblCellMar>
-            <w:top w:w="0" w:type="dxa"/>
-            <w:bottom w:w="0" w:type="dxa"/>
-          </w:tblCellMar>
-        </w:tblPrEx>
         <w:tc>
           <w:tcPr>
             <w:tcW w:w="1800" w:type="dxa"/>
@@ -8157,12 +7749,6 @@
         </w:tc>
       </w:tr>
       <w:tr>
-        <w:tblPrEx>
-          <w:tblCellMar>
-            <w:top w:w="0" w:type="dxa"/>
-            <w:bottom w:w="0" w:type="dxa"/>
-          </w:tblCellMar>
-        </w:tblPrEx>
         <w:tc>
           <w:tcPr>
             <w:tcW w:w="1800" w:type="dxa"/>
@@ -8305,12 +7891,6 @@
         <w:gridCol w:w="6160"/>
       </w:tblGrid>
       <w:tr>
-        <w:tblPrEx>
-          <w:tblCellMar>
-            <w:top w:w="0" w:type="dxa"/>
-            <w:bottom w:w="0" w:type="dxa"/>
-          </w:tblCellMar>
-        </w:tblPrEx>
         <w:tc>
           <w:tcPr>
             <w:tcW w:w="3200" w:type="dxa"/>
@@ -8373,12 +7953,6 @@
         </w:tc>
       </w:tr>
       <w:tr>
-        <w:tblPrEx>
-          <w:tblCellMar>
-            <w:top w:w="0" w:type="dxa"/>
-            <w:bottom w:w="0" w:type="dxa"/>
-          </w:tblCellMar>
-        </w:tblPrEx>
         <w:tc>
           <w:tcPr>
             <w:tcW w:w="3200" w:type="dxa"/>
@@ -8509,12 +8083,6 @@
         </w:tc>
       </w:tr>
       <w:tr>
-        <w:tblPrEx>
-          <w:tblCellMar>
-            <w:top w:w="0" w:type="dxa"/>
-            <w:bottom w:w="0" w:type="dxa"/>
-          </w:tblCellMar>
-        </w:tblPrEx>
         <w:tc>
           <w:tcPr>
             <w:tcW w:w="3200" w:type="dxa"/>
@@ -8647,12 +8215,6 @@
         </w:tc>
       </w:tr>
       <w:tr>
-        <w:tblPrEx>
-          <w:tblCellMar>
-            <w:top w:w="0" w:type="dxa"/>
-            <w:bottom w:w="0" w:type="dxa"/>
-          </w:tblCellMar>
-        </w:tblPrEx>
         <w:tc>
           <w:tcPr>
             <w:tcW w:w="3200" w:type="dxa"/>
@@ -8757,12 +8319,6 @@
         </w:tc>
       </w:tr>
       <w:tr>
-        <w:tblPrEx>
-          <w:tblCellMar>
-            <w:top w:w="0" w:type="dxa"/>
-            <w:bottom w:w="0" w:type="dxa"/>
-          </w:tblCellMar>
-        </w:tblPrEx>
         <w:tc>
           <w:tcPr>
             <w:tcW w:w="3200" w:type="dxa"/>
@@ -8821,12 +8377,6 @@
         </w:tc>
       </w:tr>
       <w:tr>
-        <w:tblPrEx>
-          <w:tblCellMar>
-            <w:top w:w="0" w:type="dxa"/>
-            <w:bottom w:w="0" w:type="dxa"/>
-          </w:tblCellMar>
-        </w:tblPrEx>
         <w:tc>
           <w:tcPr>
             <w:tcW w:w="3200" w:type="dxa"/>
@@ -8967,12 +8517,6 @@
         </w:tc>
       </w:tr>
       <w:tr>
-        <w:tblPrEx>
-          <w:tblCellMar>
-            <w:top w:w="0" w:type="dxa"/>
-            <w:bottom w:w="0" w:type="dxa"/>
-          </w:tblCellMar>
-        </w:tblPrEx>
         <w:tc>
           <w:tcPr>
             <w:tcW w:w="3200" w:type="dxa"/>

</xml_diff>